<commit_message>
docs: keep manual table rows together
Co-authored-by: motsadi <motsadi@users.noreply.github.com>
</commit_message>
<xml_diff>
--- a/docs/AI_Blasting_Suite_User_Manual.docx
+++ b/docs/AI_Blasting_Suite_User_Manual.docx
@@ -63,6 +63,7 @@
       <w:tr>
         <w:trPr>
           <w:tblHeader w:val="true"/>
+          <w:cantSplit/>
         </w:trPr>
         <w:tc>
           <w:tcPr>
@@ -118,6 +119,9 @@
         </w:tc>
       </w:tr>
       <w:tr>
+        <w:trPr>
+          <w:cantSplit/>
+        </w:trPr>
         <w:tc>
           <w:tcPr>
             <w:tcW w:type="dxa" w:w="4986"/>
@@ -166,6 +170,9 @@
         </w:tc>
       </w:tr>
       <w:tr>
+        <w:trPr>
+          <w:cantSplit/>
+        </w:trPr>
         <w:tc>
           <w:tcPr>
             <w:tcW w:type="dxa" w:w="4986"/>
@@ -216,6 +223,9 @@
         </w:tc>
       </w:tr>
       <w:tr>
+        <w:trPr>
+          <w:cantSplit/>
+        </w:trPr>
         <w:tc>
           <w:tcPr>
             <w:tcW w:type="dxa" w:w="4986"/>
@@ -264,6 +274,9 @@
         </w:tc>
       </w:tr>
       <w:tr>
+        <w:trPr>
+          <w:cantSplit/>
+        </w:trPr>
         <w:tc>
           <w:tcPr>
             <w:tcW w:type="dxa" w:w="4986"/>
@@ -314,6 +327,9 @@
         </w:tc>
       </w:tr>
       <w:tr>
+        <w:trPr>
+          <w:cantSplit/>
+        </w:trPr>
         <w:tc>
           <w:tcPr>
             <w:tcW w:type="dxa" w:w="4986"/>
@@ -362,6 +378,9 @@
         </w:tc>
       </w:tr>
       <w:tr>
+        <w:trPr>
+          <w:cantSplit/>
+        </w:trPr>
         <w:tc>
           <w:tcPr>
             <w:tcW w:type="dxa" w:w="4986"/>
@@ -600,6 +619,7 @@
       <w:tr>
         <w:trPr>
           <w:tblHeader w:val="true"/>
+          <w:cantSplit/>
         </w:trPr>
         <w:tc>
           <w:tcPr>
@@ -707,6 +727,9 @@
         </w:tc>
       </w:tr>
       <w:tr>
+        <w:trPr>
+          <w:cantSplit/>
+        </w:trPr>
         <w:tc>
           <w:tcPr>
             <w:tcW w:type="dxa" w:w="2493"/>
@@ -799,6 +822,9 @@
         </w:tc>
       </w:tr>
       <w:tr>
+        <w:trPr>
+          <w:cantSplit/>
+        </w:trPr>
         <w:tc>
           <w:tcPr>
             <w:tcW w:type="dxa" w:w="2493"/>
@@ -895,6 +921,9 @@
         </w:tc>
       </w:tr>
       <w:tr>
+        <w:trPr>
+          <w:cantSplit/>
+        </w:trPr>
         <w:tc>
           <w:tcPr>
             <w:tcW w:type="dxa" w:w="2493"/>
@@ -987,6 +1016,9 @@
         </w:tc>
       </w:tr>
       <w:tr>
+        <w:trPr>
+          <w:cantSplit/>
+        </w:trPr>
         <w:tc>
           <w:tcPr>
             <w:tcW w:type="dxa" w:w="2493"/>
@@ -1113,6 +1145,7 @@
       <w:tr>
         <w:trPr>
           <w:tblHeader w:val="true"/>
+          <w:cantSplit/>
         </w:trPr>
         <w:tc>
           <w:tcPr>
@@ -1220,6 +1253,9 @@
         </w:tc>
       </w:tr>
       <w:tr>
+        <w:trPr>
+          <w:cantSplit/>
+        </w:trPr>
         <w:tc>
           <w:tcPr>
             <w:tcW w:type="dxa" w:w="2493"/>
@@ -1314,6 +1350,9 @@
         </w:tc>
       </w:tr>
       <w:tr>
+        <w:trPr>
+          <w:cantSplit/>
+        </w:trPr>
         <w:tc>
           <w:tcPr>
             <w:tcW w:type="dxa" w:w="2493"/>
@@ -2035,6 +2074,7 @@
       <w:tr>
         <w:trPr>
           <w:tblHeader w:val="true"/>
+          <w:cantSplit/>
         </w:trPr>
         <w:tc>
           <w:tcPr>
@@ -2116,6 +2156,9 @@
         </w:tc>
       </w:tr>
       <w:tr>
+        <w:trPr>
+          <w:cantSplit/>
+        </w:trPr>
         <w:tc>
           <w:tcPr>
             <w:tcW w:type="dxa" w:w="3324"/>
@@ -2187,6 +2230,9 @@
         </w:tc>
       </w:tr>
       <w:tr>
+        <w:trPr>
+          <w:cantSplit/>
+        </w:trPr>
         <w:tc>
           <w:tcPr>
             <w:tcW w:type="dxa" w:w="3324"/>
@@ -2261,6 +2307,9 @@
         </w:tc>
       </w:tr>
       <w:tr>
+        <w:trPr>
+          <w:cantSplit/>
+        </w:trPr>
         <w:tc>
           <w:tcPr>
             <w:tcW w:type="dxa" w:w="3324"/>
@@ -2332,6 +2381,9 @@
         </w:tc>
       </w:tr>
       <w:tr>
+        <w:trPr>
+          <w:cantSplit/>
+        </w:trPr>
         <w:tc>
           <w:tcPr>
             <w:tcW w:type="dxa" w:w="3324"/>
@@ -2406,6 +2458,9 @@
         </w:tc>
       </w:tr>
       <w:tr>
+        <w:trPr>
+          <w:cantSplit/>
+        </w:trPr>
         <w:tc>
           <w:tcPr>
             <w:tcW w:type="dxa" w:w="3324"/>
@@ -2477,6 +2532,9 @@
         </w:tc>
       </w:tr>
       <w:tr>
+        <w:trPr>
+          <w:cantSplit/>
+        </w:trPr>
         <w:tc>
           <w:tcPr>
             <w:tcW w:type="dxa" w:w="3324"/>
@@ -2551,6 +2609,9 @@
         </w:tc>
       </w:tr>
       <w:tr>
+        <w:trPr>
+          <w:cantSplit/>
+        </w:trPr>
         <w:tc>
           <w:tcPr>
             <w:tcW w:type="dxa" w:w="3324"/>
@@ -2622,6 +2683,9 @@
         </w:tc>
       </w:tr>
       <w:tr>
+        <w:trPr>
+          <w:cantSplit/>
+        </w:trPr>
         <w:tc>
           <w:tcPr>
             <w:tcW w:type="dxa" w:w="3324"/>
@@ -2696,6 +2760,9 @@
         </w:tc>
       </w:tr>
       <w:tr>
+        <w:trPr>
+          <w:cantSplit/>
+        </w:trPr>
         <w:tc>
           <w:tcPr>
             <w:tcW w:type="dxa" w:w="3324"/>
@@ -2767,6 +2834,9 @@
         </w:tc>
       </w:tr>
       <w:tr>
+        <w:trPr>
+          <w:cantSplit/>
+        </w:trPr>
         <w:tc>
           <w:tcPr>
             <w:tcW w:type="dxa" w:w="3324"/>
@@ -2841,6 +2911,9 @@
         </w:tc>
       </w:tr>
       <w:tr>
+        <w:trPr>
+          <w:cantSplit/>
+        </w:trPr>
         <w:tc>
           <w:tcPr>
             <w:tcW w:type="dxa" w:w="3324"/>
@@ -2912,6 +2985,9 @@
         </w:tc>
       </w:tr>
       <w:tr>
+        <w:trPr>
+          <w:cantSplit/>
+        </w:trPr>
         <w:tc>
           <w:tcPr>
             <w:tcW w:type="dxa" w:w="3324"/>
@@ -2986,6 +3062,9 @@
         </w:tc>
       </w:tr>
       <w:tr>
+        <w:trPr>
+          <w:cantSplit/>
+        </w:trPr>
         <w:tc>
           <w:tcPr>
             <w:tcW w:type="dxa" w:w="3324"/>
@@ -3057,6 +3136,9 @@
         </w:tc>
       </w:tr>
       <w:tr>
+        <w:trPr>
+          <w:cantSplit/>
+        </w:trPr>
         <w:tc>
           <w:tcPr>
             <w:tcW w:type="dxa" w:w="3324"/>
@@ -3131,6 +3213,9 @@
         </w:tc>
       </w:tr>
       <w:tr>
+        <w:trPr>
+          <w:cantSplit/>
+        </w:trPr>
         <w:tc>
           <w:tcPr>
             <w:tcW w:type="dxa" w:w="3324"/>
@@ -3202,6 +3287,9 @@
         </w:tc>
       </w:tr>
       <w:tr>
+        <w:trPr>
+          <w:cantSplit/>
+        </w:trPr>
         <w:tc>
           <w:tcPr>
             <w:tcW w:type="dxa" w:w="3324"/>
@@ -3276,6 +3364,9 @@
         </w:tc>
       </w:tr>
       <w:tr>
+        <w:trPr>
+          <w:cantSplit/>
+        </w:trPr>
         <w:tc>
           <w:tcPr>
             <w:tcW w:type="dxa" w:w="3324"/>
@@ -3387,6 +3478,7 @@
       <w:tr>
         <w:trPr>
           <w:tblHeader w:val="true"/>
+          <w:cantSplit/>
         </w:trPr>
         <w:tc>
           <w:tcPr>
@@ -3416,6 +3508,9 @@
         </w:tc>
       </w:tr>
       <w:tr>
+        <w:trPr>
+          <w:cantSplit/>
+        </w:trPr>
         <w:tc>
           <w:tcPr>
             <w:tcW w:type="dxa" w:w="9972"/>
@@ -3441,6 +3536,9 @@
         </w:tc>
       </w:tr>
       <w:tr>
+        <w:trPr>
+          <w:cantSplit/>
+        </w:trPr>
         <w:tc>
           <w:tcPr>
             <w:tcW w:type="dxa" w:w="9972"/>
@@ -3467,6 +3565,9 @@
         </w:tc>
       </w:tr>
       <w:tr>
+        <w:trPr>
+          <w:cantSplit/>
+        </w:trPr>
         <w:tc>
           <w:tcPr>
             <w:tcW w:type="dxa" w:w="9972"/>
@@ -3492,6 +3593,9 @@
         </w:tc>
       </w:tr>
       <w:tr>
+        <w:trPr>
+          <w:cantSplit/>
+        </w:trPr>
         <w:tc>
           <w:tcPr>
             <w:tcW w:type="dxa" w:w="9972"/>
@@ -3518,6 +3622,9 @@
         </w:tc>
       </w:tr>
       <w:tr>
+        <w:trPr>
+          <w:cantSplit/>
+        </w:trPr>
         <w:tc>
           <w:tcPr>
             <w:tcW w:type="dxa" w:w="9972"/>
@@ -3543,6 +3650,9 @@
         </w:tc>
       </w:tr>
       <w:tr>
+        <w:trPr>
+          <w:cantSplit/>
+        </w:trPr>
         <w:tc>
           <w:tcPr>
             <w:tcW w:type="dxa" w:w="9972"/>
@@ -3569,6 +3679,9 @@
         </w:tc>
       </w:tr>
       <w:tr>
+        <w:trPr>
+          <w:cantSplit/>
+        </w:trPr>
         <w:tc>
           <w:tcPr>
             <w:tcW w:type="dxa" w:w="9972"/>
@@ -3594,6 +3707,9 @@
         </w:tc>
       </w:tr>
       <w:tr>
+        <w:trPr>
+          <w:cantSplit/>
+        </w:trPr>
         <w:tc>
           <w:tcPr>
             <w:tcW w:type="dxa" w:w="9972"/>
@@ -3911,6 +4027,7 @@
       <w:tr>
         <w:trPr>
           <w:tblHeader w:val="true"/>
+          <w:cantSplit/>
         </w:trPr>
         <w:tc>
           <w:tcPr>
@@ -3966,6 +4083,9 @@
         </w:tc>
       </w:tr>
       <w:tr>
+        <w:trPr>
+          <w:cantSplit/>
+        </w:trPr>
         <w:tc>
           <w:tcPr>
             <w:tcW w:type="dxa" w:w="4986"/>
@@ -4014,6 +4134,9 @@
         </w:tc>
       </w:tr>
       <w:tr>
+        <w:trPr>
+          <w:cantSplit/>
+        </w:trPr>
         <w:tc>
           <w:tcPr>
             <w:tcW w:type="dxa" w:w="4986"/>
@@ -4064,6 +4187,9 @@
         </w:tc>
       </w:tr>
       <w:tr>
+        <w:trPr>
+          <w:cantSplit/>
+        </w:trPr>
         <w:tc>
           <w:tcPr>
             <w:tcW w:type="dxa" w:w="4986"/>
@@ -4112,6 +4238,9 @@
         </w:tc>
       </w:tr>
       <w:tr>
+        <w:trPr>
+          <w:cantSplit/>
+        </w:trPr>
         <w:tc>
           <w:tcPr>
             <w:tcW w:type="dxa" w:w="4986"/>
@@ -4515,6 +4644,7 @@
       <w:tr>
         <w:trPr>
           <w:tblHeader w:val="true"/>
+          <w:cantSplit/>
         </w:trPr>
         <w:tc>
           <w:tcPr>
@@ -4596,6 +4726,9 @@
         </w:tc>
       </w:tr>
       <w:tr>
+        <w:trPr>
+          <w:cantSplit/>
+        </w:trPr>
         <w:tc>
           <w:tcPr>
             <w:tcW w:type="dxa" w:w="3324"/>
@@ -4695,6 +4828,7 @@
       <w:tr>
         <w:trPr>
           <w:tblHeader w:val="true"/>
+          <w:cantSplit/>
         </w:trPr>
         <w:tc>
           <w:tcPr>
@@ -4750,6 +4884,9 @@
         </w:tc>
       </w:tr>
       <w:tr>
+        <w:trPr>
+          <w:cantSplit/>
+        </w:trPr>
         <w:tc>
           <w:tcPr>
             <w:tcW w:type="dxa" w:w="4986"/>
@@ -4798,6 +4935,9 @@
         </w:tc>
       </w:tr>
       <w:tr>
+        <w:trPr>
+          <w:cantSplit/>
+        </w:trPr>
         <w:tc>
           <w:tcPr>
             <w:tcW w:type="dxa" w:w="4986"/>
@@ -4848,6 +4988,9 @@
         </w:tc>
       </w:tr>
       <w:tr>
+        <w:trPr>
+          <w:cantSplit/>
+        </w:trPr>
         <w:tc>
           <w:tcPr>
             <w:tcW w:type="dxa" w:w="4986"/>
@@ -4896,6 +5039,9 @@
         </w:tc>
       </w:tr>
       <w:tr>
+        <w:trPr>
+          <w:cantSplit/>
+        </w:trPr>
         <w:tc>
           <w:tcPr>
             <w:tcW w:type="dxa" w:w="4986"/>
@@ -4946,6 +5092,9 @@
         </w:tc>
       </w:tr>
       <w:tr>
+        <w:trPr>
+          <w:cantSplit/>
+        </w:trPr>
         <w:tc>
           <w:tcPr>
             <w:tcW w:type="dxa" w:w="4986"/>
@@ -5023,6 +5172,7 @@
       <w:tr>
         <w:trPr>
           <w:tblHeader w:val="true"/>
+          <w:cantSplit/>
         </w:trPr>
         <w:tc>
           <w:tcPr>
@@ -5104,6 +5254,9 @@
         </w:tc>
       </w:tr>
       <w:tr>
+        <w:trPr>
+          <w:cantSplit/>
+        </w:trPr>
         <w:tc>
           <w:tcPr>
             <w:tcW w:type="dxa" w:w="3324"/>
@@ -5175,6 +5328,9 @@
         </w:tc>
       </w:tr>
       <w:tr>
+        <w:trPr>
+          <w:cantSplit/>
+        </w:trPr>
         <w:tc>
           <w:tcPr>
             <w:tcW w:type="dxa" w:w="3324"/>
@@ -5249,6 +5405,9 @@
         </w:tc>
       </w:tr>
       <w:tr>
+        <w:trPr>
+          <w:cantSplit/>
+        </w:trPr>
         <w:tc>
           <w:tcPr>
             <w:tcW w:type="dxa" w:w="3324"/>
@@ -5320,6 +5479,9 @@
         </w:tc>
       </w:tr>
       <w:tr>
+        <w:trPr>
+          <w:cantSplit/>
+        </w:trPr>
         <w:tc>
           <w:tcPr>
             <w:tcW w:type="dxa" w:w="3324"/>
@@ -5394,6 +5556,9 @@
         </w:tc>
       </w:tr>
       <w:tr>
+        <w:trPr>
+          <w:cantSplit/>
+        </w:trPr>
         <w:tc>
           <w:tcPr>
             <w:tcW w:type="dxa" w:w="3324"/>
@@ -5465,6 +5630,9 @@
         </w:tc>
       </w:tr>
       <w:tr>
+        <w:trPr>
+          <w:cantSplit/>
+        </w:trPr>
         <w:tc>
           <w:tcPr>
             <w:tcW w:type="dxa" w:w="3324"/>
@@ -5539,6 +5707,9 @@
         </w:tc>
       </w:tr>
       <w:tr>
+        <w:trPr>
+          <w:cantSplit/>
+        </w:trPr>
         <w:tc>
           <w:tcPr>
             <w:tcW w:type="dxa" w:w="3324"/>
@@ -5610,6 +5781,9 @@
         </w:tc>
       </w:tr>
       <w:tr>
+        <w:trPr>
+          <w:cantSplit/>
+        </w:trPr>
         <w:tc>
           <w:tcPr>
             <w:tcW w:type="dxa" w:w="3324"/>
@@ -5684,6 +5858,9 @@
         </w:tc>
       </w:tr>
       <w:tr>
+        <w:trPr>
+          <w:cantSplit/>
+        </w:trPr>
         <w:tc>
           <w:tcPr>
             <w:tcW w:type="dxa" w:w="3324"/>
@@ -6163,6 +6340,7 @@
       <w:tr>
         <w:trPr>
           <w:tblHeader w:val="true"/>
+          <w:cantSplit/>
         </w:trPr>
         <w:tc>
           <w:tcPr>
@@ -6244,6 +6422,9 @@
         </w:tc>
       </w:tr>
       <w:tr>
+        <w:trPr>
+          <w:cantSplit/>
+        </w:trPr>
         <w:tc>
           <w:tcPr>
             <w:tcW w:type="dxa" w:w="3324"/>
@@ -6344,6 +6525,7 @@
       <w:tr>
         <w:trPr>
           <w:tblHeader w:val="true"/>
+          <w:cantSplit/>
         </w:trPr>
         <w:tc>
           <w:tcPr>
@@ -6425,6 +6607,9 @@
         </w:tc>
       </w:tr>
       <w:tr>
+        <w:trPr>
+          <w:cantSplit/>
+        </w:trPr>
         <w:tc>
           <w:tcPr>
             <w:tcW w:type="dxa" w:w="3324"/>
@@ -6496,6 +6681,9 @@
         </w:tc>
       </w:tr>
       <w:tr>
+        <w:trPr>
+          <w:cantSplit/>
+        </w:trPr>
         <w:tc>
           <w:tcPr>
             <w:tcW w:type="dxa" w:w="3324"/>
@@ -6570,6 +6758,9 @@
         </w:tc>
       </w:tr>
       <w:tr>
+        <w:trPr>
+          <w:cantSplit/>
+        </w:trPr>
         <w:tc>
           <w:tcPr>
             <w:tcW w:type="dxa" w:w="3324"/>
@@ -6641,6 +6832,9 @@
         </w:tc>
       </w:tr>
       <w:tr>
+        <w:trPr>
+          <w:cantSplit/>
+        </w:trPr>
         <w:tc>
           <w:tcPr>
             <w:tcW w:type="dxa" w:w="3324"/>
@@ -6715,6 +6909,9 @@
         </w:tc>
       </w:tr>
       <w:tr>
+        <w:trPr>
+          <w:cantSplit/>
+        </w:trPr>
         <w:tc>
           <w:tcPr>
             <w:tcW w:type="dxa" w:w="3324"/>
@@ -6786,6 +6983,9 @@
         </w:tc>
       </w:tr>
       <w:tr>
+        <w:trPr>
+          <w:cantSplit/>
+        </w:trPr>
         <w:tc>
           <w:tcPr>
             <w:tcW w:type="dxa" w:w="3324"/>
@@ -6860,6 +7060,9 @@
         </w:tc>
       </w:tr>
       <w:tr>
+        <w:trPr>
+          <w:cantSplit/>
+        </w:trPr>
         <w:tc>
           <w:tcPr>
             <w:tcW w:type="dxa" w:w="3324"/>
@@ -6931,6 +7134,9 @@
         </w:tc>
       </w:tr>
       <w:tr>
+        <w:trPr>
+          <w:cantSplit/>
+        </w:trPr>
         <w:tc>
           <w:tcPr>
             <w:tcW w:type="dxa" w:w="3324"/>
@@ -7005,6 +7211,9 @@
         </w:tc>
       </w:tr>
       <w:tr>
+        <w:trPr>
+          <w:cantSplit/>
+        </w:trPr>
         <w:tc>
           <w:tcPr>
             <w:tcW w:type="dxa" w:w="3324"/>
@@ -7076,6 +7285,9 @@
         </w:tc>
       </w:tr>
       <w:tr>
+        <w:trPr>
+          <w:cantSplit/>
+        </w:trPr>
         <w:tc>
           <w:tcPr>
             <w:tcW w:type="dxa" w:w="3324"/>
@@ -7150,6 +7362,9 @@
         </w:tc>
       </w:tr>
       <w:tr>
+        <w:trPr>
+          <w:cantSplit/>
+        </w:trPr>
         <w:tc>
           <w:tcPr>
             <w:tcW w:type="dxa" w:w="3324"/>
@@ -7221,6 +7436,9 @@
         </w:tc>
       </w:tr>
       <w:tr>
+        <w:trPr>
+          <w:cantSplit/>
+        </w:trPr>
         <w:tc>
           <w:tcPr>
             <w:tcW w:type="dxa" w:w="3324"/>
@@ -7324,6 +7542,7 @@
       <w:tr>
         <w:trPr>
           <w:tblHeader w:val="true"/>
+          <w:cantSplit/>
         </w:trPr>
         <w:tc>
           <w:tcPr>
@@ -7405,6 +7624,9 @@
         </w:tc>
       </w:tr>
       <w:tr>
+        <w:trPr>
+          <w:cantSplit/>
+        </w:trPr>
         <w:tc>
           <w:tcPr>
             <w:tcW w:type="dxa" w:w="3324"/>
@@ -7476,6 +7698,9 @@
         </w:tc>
       </w:tr>
       <w:tr>
+        <w:trPr>
+          <w:cantSplit/>
+        </w:trPr>
         <w:tc>
           <w:tcPr>
             <w:tcW w:type="dxa" w:w="3324"/>
@@ -7550,6 +7775,9 @@
         </w:tc>
       </w:tr>
       <w:tr>
+        <w:trPr>
+          <w:cantSplit/>
+        </w:trPr>
         <w:tc>
           <w:tcPr>
             <w:tcW w:type="dxa" w:w="3324"/>
@@ -7621,6 +7849,9 @@
         </w:tc>
       </w:tr>
       <w:tr>
+        <w:trPr>
+          <w:cantSplit/>
+        </w:trPr>
         <w:tc>
           <w:tcPr>
             <w:tcW w:type="dxa" w:w="3324"/>
@@ -7695,6 +7926,9 @@
         </w:tc>
       </w:tr>
       <w:tr>
+        <w:trPr>
+          <w:cantSplit/>
+        </w:trPr>
         <w:tc>
           <w:tcPr>
             <w:tcW w:type="dxa" w:w="3324"/>
@@ -7766,6 +8000,9 @@
         </w:tc>
       </w:tr>
       <w:tr>
+        <w:trPr>
+          <w:cantSplit/>
+        </w:trPr>
         <w:tc>
           <w:tcPr>
             <w:tcW w:type="dxa" w:w="3324"/>
@@ -7840,6 +8077,9 @@
         </w:tc>
       </w:tr>
       <w:tr>
+        <w:trPr>
+          <w:cantSplit/>
+        </w:trPr>
         <w:tc>
           <w:tcPr>
             <w:tcW w:type="dxa" w:w="3324"/>
@@ -7911,6 +8151,9 @@
         </w:tc>
       </w:tr>
       <w:tr>
+        <w:trPr>
+          <w:cantSplit/>
+        </w:trPr>
         <w:tc>
           <w:tcPr>
             <w:tcW w:type="dxa" w:w="3324"/>
@@ -7985,6 +8228,9 @@
         </w:tc>
       </w:tr>
       <w:tr>
+        <w:trPr>
+          <w:cantSplit/>
+        </w:trPr>
         <w:tc>
           <w:tcPr>
             <w:tcW w:type="dxa" w:w="3324"/>
@@ -8056,6 +8302,9 @@
         </w:tc>
       </w:tr>
       <w:tr>
+        <w:trPr>
+          <w:cantSplit/>
+        </w:trPr>
         <w:tc>
           <w:tcPr>
             <w:tcW w:type="dxa" w:w="3324"/>
@@ -8130,6 +8379,9 @@
         </w:tc>
       </w:tr>
       <w:tr>
+        <w:trPr>
+          <w:cantSplit/>
+        </w:trPr>
         <w:tc>
           <w:tcPr>
             <w:tcW w:type="dxa" w:w="3324"/>
@@ -8230,6 +8482,7 @@
       <w:tr>
         <w:trPr>
           <w:tblHeader w:val="true"/>
+          <w:cantSplit/>
         </w:trPr>
         <w:tc>
           <w:tcPr>
@@ -8311,6 +8564,9 @@
         </w:tc>
       </w:tr>
       <w:tr>
+        <w:trPr>
+          <w:cantSplit/>
+        </w:trPr>
         <w:tc>
           <w:tcPr>
             <w:tcW w:type="dxa" w:w="3324"/>
@@ -8382,6 +8638,9 @@
         </w:tc>
       </w:tr>
       <w:tr>
+        <w:trPr>
+          <w:cantSplit/>
+        </w:trPr>
         <w:tc>
           <w:tcPr>
             <w:tcW w:type="dxa" w:w="3324"/>
@@ -8456,6 +8715,9 @@
         </w:tc>
       </w:tr>
       <w:tr>
+        <w:trPr>
+          <w:cantSplit/>
+        </w:trPr>
         <w:tc>
           <w:tcPr>
             <w:tcW w:type="dxa" w:w="3324"/>
@@ -8527,6 +8789,9 @@
         </w:tc>
       </w:tr>
       <w:tr>
+        <w:trPr>
+          <w:cantSplit/>
+        </w:trPr>
         <w:tc>
           <w:tcPr>
             <w:tcW w:type="dxa" w:w="3324"/>
@@ -8601,6 +8866,9 @@
         </w:tc>
       </w:tr>
       <w:tr>
+        <w:trPr>
+          <w:cantSplit/>
+        </w:trPr>
         <w:tc>
           <w:tcPr>
             <w:tcW w:type="dxa" w:w="3324"/>
@@ -8672,6 +8940,9 @@
         </w:tc>
       </w:tr>
       <w:tr>
+        <w:trPr>
+          <w:cantSplit/>
+        </w:trPr>
         <w:tc>
           <w:tcPr>
             <w:tcW w:type="dxa" w:w="3324"/>
@@ -8746,6 +9017,9 @@
         </w:tc>
       </w:tr>
       <w:tr>
+        <w:trPr>
+          <w:cantSplit/>
+        </w:trPr>
         <w:tc>
           <w:tcPr>
             <w:tcW w:type="dxa" w:w="3324"/>
@@ -9080,6 +9354,7 @@
       <w:tr>
         <w:trPr>
           <w:tblHeader w:val="true"/>
+          <w:cantSplit/>
         </w:trPr>
         <w:tc>
           <w:tcPr>
@@ -9161,6 +9436,9 @@
         </w:tc>
       </w:tr>
       <w:tr>
+        <w:trPr>
+          <w:cantSplit/>
+        </w:trPr>
         <w:tc>
           <w:tcPr>
             <w:tcW w:type="dxa" w:w="3324"/>
@@ -9507,6 +9785,7 @@
       <w:tr>
         <w:trPr>
           <w:tblHeader w:val="true"/>
+          <w:cantSplit/>
         </w:trPr>
         <w:tc>
           <w:tcPr>
@@ -9588,6 +9867,9 @@
         </w:tc>
       </w:tr>
       <w:tr>
+        <w:trPr>
+          <w:cantSplit/>
+        </w:trPr>
         <w:tc>
           <w:tcPr>
             <w:tcW w:type="dxa" w:w="3324"/>
@@ -9687,6 +9969,7 @@
       <w:tr>
         <w:trPr>
           <w:tblHeader w:val="true"/>
+          <w:cantSplit/>
         </w:trPr>
         <w:tc>
           <w:tcPr>
@@ -9742,6 +10025,9 @@
         </w:tc>
       </w:tr>
       <w:tr>
+        <w:trPr>
+          <w:cantSplit/>
+        </w:trPr>
         <w:tc>
           <w:tcPr>
             <w:tcW w:type="dxa" w:w="4986"/>
@@ -9790,6 +10076,9 @@
         </w:tc>
       </w:tr>
       <w:tr>
+        <w:trPr>
+          <w:cantSplit/>
+        </w:trPr>
         <w:tc>
           <w:tcPr>
             <w:tcW w:type="dxa" w:w="4986"/>
@@ -9840,6 +10129,9 @@
         </w:tc>
       </w:tr>
       <w:tr>
+        <w:trPr>
+          <w:cantSplit/>
+        </w:trPr>
         <w:tc>
           <w:tcPr>
             <w:tcW w:type="dxa" w:w="4986"/>
@@ -9888,6 +10180,9 @@
         </w:tc>
       </w:tr>
       <w:tr>
+        <w:trPr>
+          <w:cantSplit/>
+        </w:trPr>
         <w:tc>
           <w:tcPr>
             <w:tcW w:type="dxa" w:w="4986"/>
@@ -9938,6 +10233,9 @@
         </w:tc>
       </w:tr>
       <w:tr>
+        <w:trPr>
+          <w:cantSplit/>
+        </w:trPr>
         <w:tc>
           <w:tcPr>
             <w:tcW w:type="dxa" w:w="4986"/>
@@ -9986,6 +10284,9 @@
         </w:tc>
       </w:tr>
       <w:tr>
+        <w:trPr>
+          <w:cantSplit/>
+        </w:trPr>
         <w:tc>
           <w:tcPr>
             <w:tcW w:type="dxa" w:w="4986"/>
@@ -10036,6 +10337,9 @@
         </w:tc>
       </w:tr>
       <w:tr>
+        <w:trPr>
+          <w:cantSplit/>
+        </w:trPr>
         <w:tc>
           <w:tcPr>
             <w:tcW w:type="dxa" w:w="4986"/>
@@ -10341,6 +10645,7 @@
       <w:tr>
         <w:trPr>
           <w:tblHeader w:val="true"/>
+          <w:cantSplit/>
         </w:trPr>
         <w:tc>
           <w:tcPr>
@@ -10422,6 +10727,9 @@
         </w:tc>
       </w:tr>
       <w:tr>
+        <w:trPr>
+          <w:cantSplit/>
+        </w:trPr>
         <w:tc>
           <w:tcPr>
             <w:tcW w:type="dxa" w:w="3324"/>
@@ -10522,6 +10830,7 @@
       <w:tr>
         <w:trPr>
           <w:tblHeader w:val="true"/>
+          <w:cantSplit/>
         </w:trPr>
         <w:tc>
           <w:tcPr>
@@ -10603,6 +10912,9 @@
         </w:tc>
       </w:tr>
       <w:tr>
+        <w:trPr>
+          <w:cantSplit/>
+        </w:trPr>
         <w:tc>
           <w:tcPr>
             <w:tcW w:type="dxa" w:w="3324"/>
@@ -10674,6 +10986,9 @@
         </w:tc>
       </w:tr>
       <w:tr>
+        <w:trPr>
+          <w:cantSplit/>
+        </w:trPr>
         <w:tc>
           <w:tcPr>
             <w:tcW w:type="dxa" w:w="3324"/>
@@ -10748,6 +11063,9 @@
         </w:tc>
       </w:tr>
       <w:tr>
+        <w:trPr>
+          <w:cantSplit/>
+        </w:trPr>
         <w:tc>
           <w:tcPr>
             <w:tcW w:type="dxa" w:w="3324"/>
@@ -10819,6 +11137,9 @@
         </w:tc>
       </w:tr>
       <w:tr>
+        <w:trPr>
+          <w:cantSplit/>
+        </w:trPr>
         <w:tc>
           <w:tcPr>
             <w:tcW w:type="dxa" w:w="3324"/>
@@ -10893,6 +11214,9 @@
         </w:tc>
       </w:tr>
       <w:tr>
+        <w:trPr>
+          <w:cantSplit/>
+        </w:trPr>
         <w:tc>
           <w:tcPr>
             <w:tcW w:type="dxa" w:w="3324"/>
@@ -10964,6 +11288,9 @@
         </w:tc>
       </w:tr>
       <w:tr>
+        <w:trPr>
+          <w:cantSplit/>
+        </w:trPr>
         <w:tc>
           <w:tcPr>
             <w:tcW w:type="dxa" w:w="3324"/>
@@ -11038,6 +11365,9 @@
         </w:tc>
       </w:tr>
       <w:tr>
+        <w:trPr>
+          <w:cantSplit/>
+        </w:trPr>
         <w:tc>
           <w:tcPr>
             <w:tcW w:type="dxa" w:w="3324"/>
@@ -11109,6 +11439,9 @@
         </w:tc>
       </w:tr>
       <w:tr>
+        <w:trPr>
+          <w:cantSplit/>
+        </w:trPr>
         <w:tc>
           <w:tcPr>
             <w:tcW w:type="dxa" w:w="3324"/>
@@ -11183,6 +11516,9 @@
         </w:tc>
       </w:tr>
       <w:tr>
+        <w:trPr>
+          <w:cantSplit/>
+        </w:trPr>
         <w:tc>
           <w:tcPr>
             <w:tcW w:type="dxa" w:w="3324"/>
@@ -11254,6 +11590,9 @@
         </w:tc>
       </w:tr>
       <w:tr>
+        <w:trPr>
+          <w:cantSplit/>
+        </w:trPr>
         <w:tc>
           <w:tcPr>
             <w:tcW w:type="dxa" w:w="3324"/>
@@ -11328,6 +11667,9 @@
         </w:tc>
       </w:tr>
       <w:tr>
+        <w:trPr>
+          <w:cantSplit/>
+        </w:trPr>
         <w:tc>
           <w:tcPr>
             <w:tcW w:type="dxa" w:w="3324"/>
@@ -11399,6 +11741,9 @@
         </w:tc>
       </w:tr>
       <w:tr>
+        <w:trPr>
+          <w:cantSplit/>
+        </w:trPr>
         <w:tc>
           <w:tcPr>
             <w:tcW w:type="dxa" w:w="3324"/>
@@ -11473,6 +11818,9 @@
         </w:tc>
       </w:tr>
       <w:tr>
+        <w:trPr>
+          <w:cantSplit/>
+        </w:trPr>
         <w:tc>
           <w:tcPr>
             <w:tcW w:type="dxa" w:w="3324"/>
@@ -11544,6 +11892,9 @@
         </w:tc>
       </w:tr>
       <w:tr>
+        <w:trPr>
+          <w:cantSplit/>
+        </w:trPr>
         <w:tc>
           <w:tcPr>
             <w:tcW w:type="dxa" w:w="3324"/>
@@ -11932,6 +12283,7 @@
       <w:tr>
         <w:trPr>
           <w:tblHeader w:val="true"/>
+          <w:cantSplit/>
         </w:trPr>
         <w:tc>
           <w:tcPr>
@@ -12013,6 +12365,9 @@
         </w:tc>
       </w:tr>
       <w:tr>
+        <w:trPr>
+          <w:cantSplit/>
+        </w:trPr>
         <w:tc>
           <w:tcPr>
             <w:tcW w:type="dxa" w:w="3324"/>
@@ -12285,6 +12640,7 @@
       <w:tr>
         <w:trPr>
           <w:tblHeader w:val="true"/>
+          <w:cantSplit/>
         </w:trPr>
         <w:tc>
           <w:tcPr>
@@ -12366,6 +12722,9 @@
         </w:tc>
       </w:tr>
       <w:tr>
+        <w:trPr>
+          <w:cantSplit/>
+        </w:trPr>
         <w:tc>
           <w:tcPr>
             <w:tcW w:type="dxa" w:w="3324"/>
@@ -12437,6 +12796,9 @@
         </w:tc>
       </w:tr>
       <w:tr>
+        <w:trPr>
+          <w:cantSplit/>
+        </w:trPr>
         <w:tc>
           <w:tcPr>
             <w:tcW w:type="dxa" w:w="3324"/>
@@ -12511,6 +12873,9 @@
         </w:tc>
       </w:tr>
       <w:tr>
+        <w:trPr>
+          <w:cantSplit/>
+        </w:trPr>
         <w:tc>
           <w:tcPr>
             <w:tcW w:type="dxa" w:w="3324"/>
@@ -12582,6 +12947,9 @@
         </w:tc>
       </w:tr>
       <w:tr>
+        <w:trPr>
+          <w:cantSplit/>
+        </w:trPr>
         <w:tc>
           <w:tcPr>
             <w:tcW w:type="dxa" w:w="3324"/>
@@ -12656,6 +13024,9 @@
         </w:tc>
       </w:tr>
       <w:tr>
+        <w:trPr>
+          <w:cantSplit/>
+        </w:trPr>
         <w:tc>
           <w:tcPr>
             <w:tcW w:type="dxa" w:w="3324"/>
@@ -12727,6 +13098,9 @@
         </w:tc>
       </w:tr>
       <w:tr>
+        <w:trPr>
+          <w:cantSplit/>
+        </w:trPr>
         <w:tc>
           <w:tcPr>
             <w:tcW w:type="dxa" w:w="3324"/>
@@ -12801,6 +13175,9 @@
         </w:tc>
       </w:tr>
       <w:tr>
+        <w:trPr>
+          <w:cantSplit/>
+        </w:trPr>
         <w:tc>
           <w:tcPr>
             <w:tcW w:type="dxa" w:w="3324"/>
@@ -13026,6 +13403,7 @@
       <w:tr>
         <w:trPr>
           <w:tblHeader w:val="true"/>
+          <w:cantSplit/>
         </w:trPr>
         <w:tc>
           <w:tcPr>
@@ -13081,6 +13459,9 @@
         </w:tc>
       </w:tr>
       <w:tr>
+        <w:trPr>
+          <w:cantSplit/>
+        </w:trPr>
         <w:tc>
           <w:tcPr>
             <w:tcW w:type="dxa" w:w="4986"/>
@@ -13129,6 +13510,9 @@
         </w:tc>
       </w:tr>
       <w:tr>
+        <w:trPr>
+          <w:cantSplit/>
+        </w:trPr>
         <w:tc>
           <w:tcPr>
             <w:tcW w:type="dxa" w:w="4986"/>
@@ -13179,6 +13563,9 @@
         </w:tc>
       </w:tr>
       <w:tr>
+        <w:trPr>
+          <w:cantSplit/>
+        </w:trPr>
         <w:tc>
           <w:tcPr>
             <w:tcW w:type="dxa" w:w="4986"/>
@@ -13227,6 +13614,9 @@
         </w:tc>
       </w:tr>
       <w:tr>
+        <w:trPr>
+          <w:cantSplit/>
+        </w:trPr>
         <w:tc>
           <w:tcPr>
             <w:tcW w:type="dxa" w:w="4986"/>
@@ -13277,6 +13667,9 @@
         </w:tc>
       </w:tr>
       <w:tr>
+        <w:trPr>
+          <w:cantSplit/>
+        </w:trPr>
         <w:tc>
           <w:tcPr>
             <w:tcW w:type="dxa" w:w="4986"/>
@@ -13325,6 +13718,9 @@
         </w:tc>
       </w:tr>
       <w:tr>
+        <w:trPr>
+          <w:cantSplit/>
+        </w:trPr>
         <w:tc>
           <w:tcPr>
             <w:tcW w:type="dxa" w:w="4986"/>
@@ -13409,6 +13805,7 @@
       <w:tr>
         <w:trPr>
           <w:tblHeader w:val="true"/>
+          <w:cantSplit/>
         </w:trPr>
         <w:tc>
           <w:tcPr>
@@ -13490,6 +13887,9 @@
         </w:tc>
       </w:tr>
       <w:tr>
+        <w:trPr>
+          <w:cantSplit/>
+        </w:trPr>
         <w:tc>
           <w:tcPr>
             <w:tcW w:type="dxa" w:w="3324"/>
@@ -13561,6 +13961,9 @@
         </w:tc>
       </w:tr>
       <w:tr>
+        <w:trPr>
+          <w:cantSplit/>
+        </w:trPr>
         <w:tc>
           <w:tcPr>
             <w:tcW w:type="dxa" w:w="3324"/>
@@ -13635,6 +14038,9 @@
         </w:tc>
       </w:tr>
       <w:tr>
+        <w:trPr>
+          <w:cantSplit/>
+        </w:trPr>
         <w:tc>
           <w:tcPr>
             <w:tcW w:type="dxa" w:w="3324"/>
@@ -13706,6 +14112,9 @@
         </w:tc>
       </w:tr>
       <w:tr>
+        <w:trPr>
+          <w:cantSplit/>
+        </w:trPr>
         <w:tc>
           <w:tcPr>
             <w:tcW w:type="dxa" w:w="3324"/>
@@ -13780,6 +14189,9 @@
         </w:tc>
       </w:tr>
       <w:tr>
+        <w:trPr>
+          <w:cantSplit/>
+        </w:trPr>
         <w:tc>
           <w:tcPr>
             <w:tcW w:type="dxa" w:w="3324"/>
@@ -13851,6 +14263,9 @@
         </w:tc>
       </w:tr>
       <w:tr>
+        <w:trPr>
+          <w:cantSplit/>
+        </w:trPr>
         <w:tc>
           <w:tcPr>
             <w:tcW w:type="dxa" w:w="3324"/>
@@ -13925,6 +14340,9 @@
         </w:tc>
       </w:tr>
       <w:tr>
+        <w:trPr>
+          <w:cantSplit/>
+        </w:trPr>
         <w:tc>
           <w:tcPr>
             <w:tcW w:type="dxa" w:w="3324"/>
@@ -13996,6 +14414,9 @@
         </w:tc>
       </w:tr>
       <w:tr>
+        <w:trPr>
+          <w:cantSplit/>
+        </w:trPr>
         <w:tc>
           <w:tcPr>
             <w:tcW w:type="dxa" w:w="3324"/>
@@ -14070,6 +14491,9 @@
         </w:tc>
       </w:tr>
       <w:tr>
+        <w:trPr>
+          <w:cantSplit/>
+        </w:trPr>
         <w:tc>
           <w:tcPr>
             <w:tcW w:type="dxa" w:w="3324"/>
@@ -14141,6 +14565,9 @@
         </w:tc>
       </w:tr>
       <w:tr>
+        <w:trPr>
+          <w:cantSplit/>
+        </w:trPr>
         <w:tc>
           <w:tcPr>
             <w:tcW w:type="dxa" w:w="3324"/>
@@ -14215,6 +14642,9 @@
         </w:tc>
       </w:tr>
       <w:tr>
+        <w:trPr>
+          <w:cantSplit/>
+        </w:trPr>
         <w:tc>
           <w:tcPr>
             <w:tcW w:type="dxa" w:w="3324"/>
@@ -14286,6 +14716,9 @@
         </w:tc>
       </w:tr>
       <w:tr>
+        <w:trPr>
+          <w:cantSplit/>
+        </w:trPr>
         <w:tc>
           <w:tcPr>
             <w:tcW w:type="dxa" w:w="3324"/>
@@ -14389,6 +14822,7 @@
       <w:tr>
         <w:trPr>
           <w:tblHeader w:val="true"/>
+          <w:cantSplit/>
         </w:trPr>
         <w:tc>
           <w:tcPr>
@@ -14470,6 +14904,9 @@
         </w:tc>
       </w:tr>
       <w:tr>
+        <w:trPr>
+          <w:cantSplit/>
+        </w:trPr>
         <w:tc>
           <w:tcPr>
             <w:tcW w:type="dxa" w:w="3324"/>
@@ -14541,6 +14978,9 @@
         </w:tc>
       </w:tr>
       <w:tr>
+        <w:trPr>
+          <w:cantSplit/>
+        </w:trPr>
         <w:tc>
           <w:tcPr>
             <w:tcW w:type="dxa" w:w="3324"/>
@@ -14615,6 +15055,9 @@
         </w:tc>
       </w:tr>
       <w:tr>
+        <w:trPr>
+          <w:cantSplit/>
+        </w:trPr>
         <w:tc>
           <w:tcPr>
             <w:tcW w:type="dxa" w:w="3324"/>
@@ -14686,6 +15129,9 @@
         </w:tc>
       </w:tr>
       <w:tr>
+        <w:trPr>
+          <w:cantSplit/>
+        </w:trPr>
         <w:tc>
           <w:tcPr>
             <w:tcW w:type="dxa" w:w="3324"/>
@@ -14760,6 +15206,9 @@
         </w:tc>
       </w:tr>
       <w:tr>
+        <w:trPr>
+          <w:cantSplit/>
+        </w:trPr>
         <w:tc>
           <w:tcPr>
             <w:tcW w:type="dxa" w:w="3324"/>
@@ -14831,6 +15280,9 @@
         </w:tc>
       </w:tr>
       <w:tr>
+        <w:trPr>
+          <w:cantSplit/>
+        </w:trPr>
         <w:tc>
           <w:tcPr>
             <w:tcW w:type="dxa" w:w="3324"/>
@@ -14905,6 +15357,9 @@
         </w:tc>
       </w:tr>
       <w:tr>
+        <w:trPr>
+          <w:cantSplit/>
+        </w:trPr>
         <w:tc>
           <w:tcPr>
             <w:tcW w:type="dxa" w:w="3324"/>
@@ -14976,6 +15431,9 @@
         </w:tc>
       </w:tr>
       <w:tr>
+        <w:trPr>
+          <w:cantSplit/>
+        </w:trPr>
         <w:tc>
           <w:tcPr>
             <w:tcW w:type="dxa" w:w="3324"/>
@@ -15050,6 +15508,9 @@
         </w:tc>
       </w:tr>
       <w:tr>
+        <w:trPr>
+          <w:cantSplit/>
+        </w:trPr>
         <w:tc>
           <w:tcPr>
             <w:tcW w:type="dxa" w:w="3324"/>
@@ -15121,6 +15582,9 @@
         </w:tc>
       </w:tr>
       <w:tr>
+        <w:trPr>
+          <w:cantSplit/>
+        </w:trPr>
         <w:tc>
           <w:tcPr>
             <w:tcW w:type="dxa" w:w="3324"/>
@@ -15195,6 +15659,9 @@
         </w:tc>
       </w:tr>
       <w:tr>
+        <w:trPr>
+          <w:cantSplit/>
+        </w:trPr>
         <w:tc>
           <w:tcPr>
             <w:tcW w:type="dxa" w:w="3324"/>
@@ -15266,6 +15733,9 @@
         </w:tc>
       </w:tr>
       <w:tr>
+        <w:trPr>
+          <w:cantSplit/>
+        </w:trPr>
         <w:tc>
           <w:tcPr>
             <w:tcW w:type="dxa" w:w="3324"/>
@@ -15419,6 +15889,7 @@
       <w:tr>
         <w:trPr>
           <w:tblHeader w:val="true"/>
+          <w:cantSplit/>
         </w:trPr>
         <w:tc>
           <w:tcPr>
@@ -15474,6 +15945,9 @@
         </w:tc>
       </w:tr>
       <w:tr>
+        <w:trPr>
+          <w:cantSplit/>
+        </w:trPr>
         <w:tc>
           <w:tcPr>
             <w:tcW w:type="dxa" w:w="4986"/>
@@ -15522,6 +15996,9 @@
         </w:tc>
       </w:tr>
       <w:tr>
+        <w:trPr>
+          <w:cantSplit/>
+        </w:trPr>
         <w:tc>
           <w:tcPr>
             <w:tcW w:type="dxa" w:w="4986"/>
@@ -15572,6 +16049,9 @@
         </w:tc>
       </w:tr>
       <w:tr>
+        <w:trPr>
+          <w:cantSplit/>
+        </w:trPr>
         <w:tc>
           <w:tcPr>
             <w:tcW w:type="dxa" w:w="4986"/>
@@ -15620,6 +16100,9 @@
         </w:tc>
       </w:tr>
       <w:tr>
+        <w:trPr>
+          <w:cantSplit/>
+        </w:trPr>
         <w:tc>
           <w:tcPr>
             <w:tcW w:type="dxa" w:w="4986"/>
@@ -15698,6 +16181,7 @@
       <w:tr>
         <w:trPr>
           <w:tblHeader w:val="true"/>
+          <w:cantSplit/>
         </w:trPr>
         <w:tc>
           <w:tcPr>
@@ -15753,6 +16237,9 @@
         </w:tc>
       </w:tr>
       <w:tr>
+        <w:trPr>
+          <w:cantSplit/>
+        </w:trPr>
         <w:tc>
           <w:tcPr>
             <w:tcW w:type="dxa" w:w="4986"/>
@@ -15801,6 +16288,9 @@
         </w:tc>
       </w:tr>
       <w:tr>
+        <w:trPr>
+          <w:cantSplit/>
+        </w:trPr>
         <w:tc>
           <w:tcPr>
             <w:tcW w:type="dxa" w:w="4986"/>
@@ -15851,6 +16341,9 @@
         </w:tc>
       </w:tr>
       <w:tr>
+        <w:trPr>
+          <w:cantSplit/>
+        </w:trPr>
         <w:tc>
           <w:tcPr>
             <w:tcW w:type="dxa" w:w="4986"/>
@@ -15899,6 +16392,9 @@
         </w:tc>
       </w:tr>
       <w:tr>
+        <w:trPr>
+          <w:cantSplit/>
+        </w:trPr>
         <w:tc>
           <w:tcPr>
             <w:tcW w:type="dxa" w:w="4986"/>
@@ -15949,6 +16445,9 @@
         </w:tc>
       </w:tr>
       <w:tr>
+        <w:trPr>
+          <w:cantSplit/>
+        </w:trPr>
         <w:tc>
           <w:tcPr>
             <w:tcW w:type="dxa" w:w="4986"/>
@@ -15997,6 +16496,9 @@
         </w:tc>
       </w:tr>
       <w:tr>
+        <w:trPr>
+          <w:cantSplit/>
+        </w:trPr>
         <w:tc>
           <w:tcPr>
             <w:tcW w:type="dxa" w:w="4986"/>
@@ -16047,6 +16549,9 @@
         </w:tc>
       </w:tr>
       <w:tr>
+        <w:trPr>
+          <w:cantSplit/>
+        </w:trPr>
         <w:tc>
           <w:tcPr>
             <w:tcW w:type="dxa" w:w="4986"/>
@@ -16095,6 +16600,9 @@
         </w:tc>
       </w:tr>
       <w:tr>
+        <w:trPr>
+          <w:cantSplit/>
+        </w:trPr>
         <w:tc>
           <w:tcPr>
             <w:tcW w:type="dxa" w:w="4986"/>
@@ -16230,6 +16738,7 @@
       <w:tr>
         <w:trPr>
           <w:tblHeader w:val="true"/>
+          <w:cantSplit/>
         </w:trPr>
         <w:tc>
           <w:tcPr>
@@ -16285,6 +16794,9 @@
         </w:tc>
       </w:tr>
       <w:tr>
+        <w:trPr>
+          <w:cantSplit/>
+        </w:trPr>
         <w:tc>
           <w:tcPr>
             <w:tcW w:type="dxa" w:w="4986"/>
@@ -16333,6 +16845,9 @@
         </w:tc>
       </w:tr>
       <w:tr>
+        <w:trPr>
+          <w:cantSplit/>
+        </w:trPr>
         <w:tc>
           <w:tcPr>
             <w:tcW w:type="dxa" w:w="4986"/>
@@ -16383,6 +16898,9 @@
         </w:tc>
       </w:tr>
       <w:tr>
+        <w:trPr>
+          <w:cantSplit/>
+        </w:trPr>
         <w:tc>
           <w:tcPr>
             <w:tcW w:type="dxa" w:w="4986"/>
@@ -16431,6 +16949,9 @@
         </w:tc>
       </w:tr>
       <w:tr>
+        <w:trPr>
+          <w:cantSplit/>
+        </w:trPr>
         <w:tc>
           <w:tcPr>
             <w:tcW w:type="dxa" w:w="4986"/>
@@ -16481,6 +17002,9 @@
         </w:tc>
       </w:tr>
       <w:tr>
+        <w:trPr>
+          <w:cantSplit/>
+        </w:trPr>
         <w:tc>
           <w:tcPr>
             <w:tcW w:type="dxa" w:w="4986"/>
@@ -16529,6 +17053,9 @@
         </w:tc>
       </w:tr>
       <w:tr>
+        <w:trPr>
+          <w:cantSplit/>
+        </w:trPr>
         <w:tc>
           <w:tcPr>
             <w:tcW w:type="dxa" w:w="4986"/>
@@ -16579,6 +17106,9 @@
         </w:tc>
       </w:tr>
       <w:tr>
+        <w:trPr>
+          <w:cantSplit/>
+        </w:trPr>
         <w:tc>
           <w:tcPr>
             <w:tcW w:type="dxa" w:w="4986"/>
@@ -16660,6 +17190,7 @@
       <w:tr>
         <w:trPr>
           <w:tblHeader w:val="true"/>
+          <w:cantSplit/>
         </w:trPr>
         <w:tc>
           <w:tcPr>
@@ -16715,6 +17246,9 @@
         </w:tc>
       </w:tr>
       <w:tr>
+        <w:trPr>
+          <w:cantSplit/>
+        </w:trPr>
         <w:tc>
           <w:tcPr>
             <w:tcW w:type="dxa" w:w="4986"/>
@@ -16763,6 +17297,9 @@
         </w:tc>
       </w:tr>
       <w:tr>
+        <w:trPr>
+          <w:cantSplit/>
+        </w:trPr>
         <w:tc>
           <w:tcPr>
             <w:tcW w:type="dxa" w:w="4986"/>
@@ -16813,6 +17350,9 @@
         </w:tc>
       </w:tr>
       <w:tr>
+        <w:trPr>
+          <w:cantSplit/>
+        </w:trPr>
         <w:tc>
           <w:tcPr>
             <w:tcW w:type="dxa" w:w="4986"/>
@@ -16890,6 +17430,7 @@
       <w:tr>
         <w:trPr>
           <w:tblHeader w:val="true"/>
+          <w:cantSplit/>
         </w:trPr>
         <w:tc>
           <w:tcPr>
@@ -16971,6 +17512,9 @@
         </w:tc>
       </w:tr>
       <w:tr>
+        <w:trPr>
+          <w:cantSplit/>
+        </w:trPr>
         <w:tc>
           <w:tcPr>
             <w:tcW w:type="dxa" w:w="3324"/>
@@ -17071,6 +17615,7 @@
       <w:tr>
         <w:trPr>
           <w:tblHeader w:val="true"/>
+          <w:cantSplit/>
         </w:trPr>
         <w:tc>
           <w:tcPr>
@@ -17152,6 +17697,9 @@
         </w:tc>
       </w:tr>
       <w:tr>
+        <w:trPr>
+          <w:cantSplit/>
+        </w:trPr>
         <w:tc>
           <w:tcPr>
             <w:tcW w:type="dxa" w:w="3324"/>
@@ -17223,6 +17771,9 @@
         </w:tc>
       </w:tr>
       <w:tr>
+        <w:trPr>
+          <w:cantSplit/>
+        </w:trPr>
         <w:tc>
           <w:tcPr>
             <w:tcW w:type="dxa" w:w="3324"/>
@@ -17297,6 +17848,9 @@
         </w:tc>
       </w:tr>
       <w:tr>
+        <w:trPr>
+          <w:cantSplit/>
+        </w:trPr>
         <w:tc>
           <w:tcPr>
             <w:tcW w:type="dxa" w:w="3324"/>
@@ -17368,6 +17922,9 @@
         </w:tc>
       </w:tr>
       <w:tr>
+        <w:trPr>
+          <w:cantSplit/>
+        </w:trPr>
         <w:tc>
           <w:tcPr>
             <w:tcW w:type="dxa" w:w="3324"/>
@@ -17442,6 +17999,9 @@
         </w:tc>
       </w:tr>
       <w:tr>
+        <w:trPr>
+          <w:cantSplit/>
+        </w:trPr>
         <w:tc>
           <w:tcPr>
             <w:tcW w:type="dxa" w:w="3324"/>
@@ -17513,6 +18073,9 @@
         </w:tc>
       </w:tr>
       <w:tr>
+        <w:trPr>
+          <w:cantSplit/>
+        </w:trPr>
         <w:tc>
           <w:tcPr>
             <w:tcW w:type="dxa" w:w="3324"/>
@@ -17587,6 +18150,9 @@
         </w:tc>
       </w:tr>
       <w:tr>
+        <w:trPr>
+          <w:cantSplit/>
+        </w:trPr>
         <w:tc>
           <w:tcPr>
             <w:tcW w:type="dxa" w:w="3324"/>
@@ -17878,6 +18444,7 @@
       <w:tr>
         <w:trPr>
           <w:tblHeader w:val="true"/>
+          <w:cantSplit/>
         </w:trPr>
         <w:tc>
           <w:tcPr>
@@ -17959,6 +18526,9 @@
         </w:tc>
       </w:tr>
       <w:tr>
+        <w:trPr>
+          <w:cantSplit/>
+        </w:trPr>
         <w:tc>
           <w:tcPr>
             <w:tcW w:type="dxa" w:w="3324"/>
@@ -18058,6 +18628,7 @@
       <w:tr>
         <w:trPr>
           <w:tblHeader w:val="true"/>
+          <w:cantSplit/>
         </w:trPr>
         <w:tc>
           <w:tcPr>
@@ -18113,6 +18684,9 @@
         </w:tc>
       </w:tr>
       <w:tr>
+        <w:trPr>
+          <w:cantSplit/>
+        </w:trPr>
         <w:tc>
           <w:tcPr>
             <w:tcW w:type="dxa" w:w="4986"/>
@@ -18161,6 +18735,9 @@
         </w:tc>
       </w:tr>
       <w:tr>
+        <w:trPr>
+          <w:cantSplit/>
+        </w:trPr>
         <w:tc>
           <w:tcPr>
             <w:tcW w:type="dxa" w:w="4986"/>
@@ -18211,6 +18788,9 @@
         </w:tc>
       </w:tr>
       <w:tr>
+        <w:trPr>
+          <w:cantSplit/>
+        </w:trPr>
         <w:tc>
           <w:tcPr>
             <w:tcW w:type="dxa" w:w="4986"/>
@@ -18259,6 +18839,9 @@
         </w:tc>
       </w:tr>
       <w:tr>
+        <w:trPr>
+          <w:cantSplit/>
+        </w:trPr>
         <w:tc>
           <w:tcPr>
             <w:tcW w:type="dxa" w:w="4986"/>
@@ -18309,6 +18892,9 @@
         </w:tc>
       </w:tr>
       <w:tr>
+        <w:trPr>
+          <w:cantSplit/>
+        </w:trPr>
         <w:tc>
           <w:tcPr>
             <w:tcW w:type="dxa" w:w="4986"/>
@@ -18357,6 +18943,9 @@
         </w:tc>
       </w:tr>
       <w:tr>
+        <w:trPr>
+          <w:cantSplit/>
+        </w:trPr>
         <w:tc>
           <w:tcPr>
             <w:tcW w:type="dxa" w:w="4986"/>
@@ -18585,6 +19174,7 @@
       <w:tr>
         <w:trPr>
           <w:tblHeader w:val="true"/>
+          <w:cantSplit/>
         </w:trPr>
         <w:tc>
           <w:tcPr>
@@ -18666,6 +19256,9 @@
         </w:tc>
       </w:tr>
       <w:tr>
+        <w:trPr>
+          <w:cantSplit/>
+        </w:trPr>
         <w:tc>
           <w:tcPr>
             <w:tcW w:type="dxa" w:w="3324"/>
@@ -18765,6 +19358,7 @@
       <w:tr>
         <w:trPr>
           <w:tblHeader w:val="true"/>
+          <w:cantSplit/>
         </w:trPr>
         <w:tc>
           <w:tcPr>
@@ -18820,6 +19414,9 @@
         </w:tc>
       </w:tr>
       <w:tr>
+        <w:trPr>
+          <w:cantSplit/>
+        </w:trPr>
         <w:tc>
           <w:tcPr>
             <w:tcW w:type="dxa" w:w="4986"/>
@@ -18868,6 +19465,9 @@
         </w:tc>
       </w:tr>
       <w:tr>
+        <w:trPr>
+          <w:cantSplit/>
+        </w:trPr>
         <w:tc>
           <w:tcPr>
             <w:tcW w:type="dxa" w:w="4986"/>
@@ -18918,6 +19518,9 @@
         </w:tc>
       </w:tr>
       <w:tr>
+        <w:trPr>
+          <w:cantSplit/>
+        </w:trPr>
         <w:tc>
           <w:tcPr>
             <w:tcW w:type="dxa" w:w="4986"/>
@@ -18966,6 +19569,9 @@
         </w:tc>
       </w:tr>
       <w:tr>
+        <w:trPr>
+          <w:cantSplit/>
+        </w:trPr>
         <w:tc>
           <w:tcPr>
             <w:tcW w:type="dxa" w:w="4986"/>
@@ -19016,6 +19622,9 @@
         </w:tc>
       </w:tr>
       <w:tr>
+        <w:trPr>
+          <w:cantSplit/>
+        </w:trPr>
         <w:tc>
           <w:tcPr>
             <w:tcW w:type="dxa" w:w="4986"/>
@@ -19064,6 +19673,9 @@
         </w:tc>
       </w:tr>
       <w:tr>
+        <w:trPr>
+          <w:cantSplit/>
+        </w:trPr>
         <w:tc>
           <w:tcPr>
             <w:tcW w:type="dxa" w:w="4986"/>
@@ -19114,6 +19726,9 @@
         </w:tc>
       </w:tr>
       <w:tr>
+        <w:trPr>
+          <w:cantSplit/>
+        </w:trPr>
         <w:tc>
           <w:tcPr>
             <w:tcW w:type="dxa" w:w="4986"/>
@@ -19405,6 +20020,7 @@
       <w:tr>
         <w:trPr>
           <w:tblHeader w:val="true"/>
+          <w:cantSplit/>
         </w:trPr>
         <w:tc>
           <w:tcPr>
@@ -19486,6 +20102,9 @@
         </w:tc>
       </w:tr>
       <w:tr>
+        <w:trPr>
+          <w:cantSplit/>
+        </w:trPr>
         <w:tc>
           <w:tcPr>
             <w:tcW w:type="dxa" w:w="3324"/>
@@ -19557,6 +20176,9 @@
         </w:tc>
       </w:tr>
       <w:tr>
+        <w:trPr>
+          <w:cantSplit/>
+        </w:trPr>
         <w:tc>
           <w:tcPr>
             <w:tcW w:type="dxa" w:w="3324"/>
@@ -19631,6 +20253,9 @@
         </w:tc>
       </w:tr>
       <w:tr>
+        <w:trPr>
+          <w:cantSplit/>
+        </w:trPr>
         <w:tc>
           <w:tcPr>
             <w:tcW w:type="dxa" w:w="3324"/>
@@ -19702,6 +20327,9 @@
         </w:tc>
       </w:tr>
       <w:tr>
+        <w:trPr>
+          <w:cantSplit/>
+        </w:trPr>
         <w:tc>
           <w:tcPr>
             <w:tcW w:type="dxa" w:w="3324"/>
@@ -19776,6 +20404,9 @@
         </w:tc>
       </w:tr>
       <w:tr>
+        <w:trPr>
+          <w:cantSplit/>
+        </w:trPr>
         <w:tc>
           <w:tcPr>
             <w:tcW w:type="dxa" w:w="3324"/>
@@ -19847,6 +20478,9 @@
         </w:tc>
       </w:tr>
       <w:tr>
+        <w:trPr>
+          <w:cantSplit/>
+        </w:trPr>
         <w:tc>
           <w:tcPr>
             <w:tcW w:type="dxa" w:w="3324"/>
@@ -19921,6 +20555,9 @@
         </w:tc>
       </w:tr>
       <w:tr>
+        <w:trPr>
+          <w:cantSplit/>
+        </w:trPr>
         <w:tc>
           <w:tcPr>
             <w:tcW w:type="dxa" w:w="3324"/>
@@ -19992,6 +20629,9 @@
         </w:tc>
       </w:tr>
       <w:tr>
+        <w:trPr>
+          <w:cantSplit/>
+        </w:trPr>
         <w:tc>
           <w:tcPr>
             <w:tcW w:type="dxa" w:w="3324"/>
@@ -20066,6 +20706,9 @@
         </w:tc>
       </w:tr>
       <w:tr>
+        <w:trPr>
+          <w:cantSplit/>
+        </w:trPr>
         <w:tc>
           <w:tcPr>
             <w:tcW w:type="dxa" w:w="3324"/>
@@ -20275,6 +20918,7 @@
       <w:tr>
         <w:trPr>
           <w:tblHeader w:val="true"/>
+          <w:cantSplit/>
         </w:trPr>
         <w:tc>
           <w:tcPr>
@@ -20356,6 +21000,9 @@
         </w:tc>
       </w:tr>
       <w:tr>
+        <w:trPr>
+          <w:cantSplit/>
+        </w:trPr>
         <w:tc>
           <w:tcPr>
             <w:tcW w:type="dxa" w:w="3324"/>
@@ -20427,6 +21074,9 @@
         </w:tc>
       </w:tr>
       <w:tr>
+        <w:trPr>
+          <w:cantSplit/>
+        </w:trPr>
         <w:tc>
           <w:tcPr>
             <w:tcW w:type="dxa" w:w="3324"/>
@@ -20501,6 +21151,9 @@
         </w:tc>
       </w:tr>
       <w:tr>
+        <w:trPr>
+          <w:cantSplit/>
+        </w:trPr>
         <w:tc>
           <w:tcPr>
             <w:tcW w:type="dxa" w:w="3324"/>
@@ -20572,6 +21225,9 @@
         </w:tc>
       </w:tr>
       <w:tr>
+        <w:trPr>
+          <w:cantSplit/>
+        </w:trPr>
         <w:tc>
           <w:tcPr>
             <w:tcW w:type="dxa" w:w="3324"/>
@@ -20646,6 +21302,9 @@
         </w:tc>
       </w:tr>
       <w:tr>
+        <w:trPr>
+          <w:cantSplit/>
+        </w:trPr>
         <w:tc>
           <w:tcPr>
             <w:tcW w:type="dxa" w:w="3324"/>
@@ -20717,6 +21376,9 @@
         </w:tc>
       </w:tr>
       <w:tr>
+        <w:trPr>
+          <w:cantSplit/>
+        </w:trPr>
         <w:tc>
           <w:tcPr>
             <w:tcW w:type="dxa" w:w="3324"/>
@@ -20791,6 +21453,9 @@
         </w:tc>
       </w:tr>
       <w:tr>
+        <w:trPr>
+          <w:cantSplit/>
+        </w:trPr>
         <w:tc>
           <w:tcPr>
             <w:tcW w:type="dxa" w:w="3324"/>
@@ -20862,6 +21527,9 @@
         </w:tc>
       </w:tr>
       <w:tr>
+        <w:trPr>
+          <w:cantSplit/>
+        </w:trPr>
         <w:tc>
           <w:tcPr>
             <w:tcW w:type="dxa" w:w="3324"/>
@@ -20936,6 +21604,9 @@
         </w:tc>
       </w:tr>
       <w:tr>
+        <w:trPr>
+          <w:cantSplit/>
+        </w:trPr>
         <w:tc>
           <w:tcPr>
             <w:tcW w:type="dxa" w:w="3324"/>
@@ -21007,6 +21678,9 @@
         </w:tc>
       </w:tr>
       <w:tr>
+        <w:trPr>
+          <w:cantSplit/>
+        </w:trPr>
         <w:tc>
           <w:tcPr>
             <w:tcW w:type="dxa" w:w="3324"/>
@@ -21081,6 +21755,9 @@
         </w:tc>
       </w:tr>
       <w:tr>
+        <w:trPr>
+          <w:cantSplit/>
+        </w:trPr>
         <w:tc>
           <w:tcPr>
             <w:tcW w:type="dxa" w:w="3324"/>
@@ -21152,6 +21829,9 @@
         </w:tc>
       </w:tr>
       <w:tr>
+        <w:trPr>
+          <w:cantSplit/>
+        </w:trPr>
         <w:tc>
           <w:tcPr>
             <w:tcW w:type="dxa" w:w="3324"/>
@@ -21226,6 +21906,9 @@
         </w:tc>
       </w:tr>
       <w:tr>
+        <w:trPr>
+          <w:cantSplit/>
+        </w:trPr>
         <w:tc>
           <w:tcPr>
             <w:tcW w:type="dxa" w:w="3324"/>
@@ -21297,6 +21980,9 @@
         </w:tc>
       </w:tr>
       <w:tr>
+        <w:trPr>
+          <w:cantSplit/>
+        </w:trPr>
         <w:tc>
           <w:tcPr>
             <w:tcW w:type="dxa" w:w="3324"/>
@@ -21371,6 +22057,9 @@
         </w:tc>
       </w:tr>
       <w:tr>
+        <w:trPr>
+          <w:cantSplit/>
+        </w:trPr>
         <w:tc>
           <w:tcPr>
             <w:tcW w:type="dxa" w:w="3324"/>
@@ -21569,6 +22258,7 @@
       <w:tr>
         <w:trPr>
           <w:tblHeader w:val="true"/>
+          <w:cantSplit/>
         </w:trPr>
         <w:tc>
           <w:tcPr>
@@ -21624,6 +22314,9 @@
         </w:tc>
       </w:tr>
       <w:tr>
+        <w:trPr>
+          <w:cantSplit/>
+        </w:trPr>
         <w:tc>
           <w:tcPr>
             <w:tcW w:type="dxa" w:w="4986"/>
@@ -21672,6 +22365,9 @@
         </w:tc>
       </w:tr>
       <w:tr>
+        <w:trPr>
+          <w:cantSplit/>
+        </w:trPr>
         <w:tc>
           <w:tcPr>
             <w:tcW w:type="dxa" w:w="4986"/>
@@ -21722,6 +22418,9 @@
         </w:tc>
       </w:tr>
       <w:tr>
+        <w:trPr>
+          <w:cantSplit/>
+        </w:trPr>
         <w:tc>
           <w:tcPr>
             <w:tcW w:type="dxa" w:w="4986"/>
@@ -21770,6 +22469,9 @@
         </w:tc>
       </w:tr>
       <w:tr>
+        <w:trPr>
+          <w:cantSplit/>
+        </w:trPr>
         <w:tc>
           <w:tcPr>
             <w:tcW w:type="dxa" w:w="4986"/>
@@ -21820,6 +22522,9 @@
         </w:tc>
       </w:tr>
       <w:tr>
+        <w:trPr>
+          <w:cantSplit/>
+        </w:trPr>
         <w:tc>
           <w:tcPr>
             <w:tcW w:type="dxa" w:w="4986"/>
@@ -21868,6 +22573,9 @@
         </w:tc>
       </w:tr>
       <w:tr>
+        <w:trPr>
+          <w:cantSplit/>
+        </w:trPr>
         <w:tc>
           <w:tcPr>
             <w:tcW w:type="dxa" w:w="4986"/>
@@ -21918,6 +22626,9 @@
         </w:tc>
       </w:tr>
       <w:tr>
+        <w:trPr>
+          <w:cantSplit/>
+        </w:trPr>
         <w:tc>
           <w:tcPr>
             <w:tcW w:type="dxa" w:w="4986"/>
@@ -21966,6 +22677,9 @@
         </w:tc>
       </w:tr>
       <w:tr>
+        <w:trPr>
+          <w:cantSplit/>
+        </w:trPr>
         <w:tc>
           <w:tcPr>
             <w:tcW w:type="dxa" w:w="4986"/>
@@ -22016,6 +22730,9 @@
         </w:tc>
       </w:tr>
       <w:tr>
+        <w:trPr>
+          <w:cantSplit/>
+        </w:trPr>
         <w:tc>
           <w:tcPr>
             <w:tcW w:type="dxa" w:w="4986"/>
@@ -22064,6 +22781,9 @@
         </w:tc>
       </w:tr>
       <w:tr>
+        <w:trPr>
+          <w:cantSplit/>
+        </w:trPr>
         <w:tc>
           <w:tcPr>
             <w:tcW w:type="dxa" w:w="4986"/>
@@ -22114,6 +22834,9 @@
         </w:tc>
       </w:tr>
       <w:tr>
+        <w:trPr>
+          <w:cantSplit/>
+        </w:trPr>
         <w:tc>
           <w:tcPr>
             <w:tcW w:type="dxa" w:w="4986"/>
@@ -22162,6 +22885,9 @@
         </w:tc>
       </w:tr>
       <w:tr>
+        <w:trPr>
+          <w:cantSplit/>
+        </w:trPr>
         <w:tc>
           <w:tcPr>
             <w:tcW w:type="dxa" w:w="4986"/>
@@ -22212,6 +22938,9 @@
         </w:tc>
       </w:tr>
       <w:tr>
+        <w:trPr>
+          <w:cantSplit/>
+        </w:trPr>
         <w:tc>
           <w:tcPr>
             <w:tcW w:type="dxa" w:w="4986"/>
@@ -22260,6 +22989,9 @@
         </w:tc>
       </w:tr>
       <w:tr>
+        <w:trPr>
+          <w:cantSplit/>
+        </w:trPr>
         <w:tc>
           <w:tcPr>
             <w:tcW w:type="dxa" w:w="4986"/>
@@ -22310,6 +23042,9 @@
         </w:tc>
       </w:tr>
       <w:tr>
+        <w:trPr>
+          <w:cantSplit/>
+        </w:trPr>
         <w:tc>
           <w:tcPr>
             <w:tcW w:type="dxa" w:w="4986"/>
@@ -22358,6 +23093,9 @@
         </w:tc>
       </w:tr>
       <w:tr>
+        <w:trPr>
+          <w:cantSplit/>
+        </w:trPr>
         <w:tc>
           <w:tcPr>
             <w:tcW w:type="dxa" w:w="4986"/>
@@ -22408,6 +23146,9 @@
         </w:tc>
       </w:tr>
       <w:tr>
+        <w:trPr>
+          <w:cantSplit/>
+        </w:trPr>
         <w:tc>
           <w:tcPr>
             <w:tcW w:type="dxa" w:w="4986"/>
@@ -22456,6 +23197,9 @@
         </w:tc>
       </w:tr>
       <w:tr>
+        <w:trPr>
+          <w:cantSplit/>
+        </w:trPr>
         <w:tc>
           <w:tcPr>
             <w:tcW w:type="dxa" w:w="4986"/>
@@ -22506,6 +23250,9 @@
         </w:tc>
       </w:tr>
       <w:tr>
+        <w:trPr>
+          <w:cantSplit/>
+        </w:trPr>
         <w:tc>
           <w:tcPr>
             <w:tcW w:type="dxa" w:w="4986"/>
@@ -22588,6 +23335,7 @@
       <w:tr>
         <w:trPr>
           <w:tblHeader w:val="true"/>
+          <w:cantSplit/>
         </w:trPr>
         <w:tc>
           <w:tcPr>
@@ -22669,6 +23417,9 @@
         </w:tc>
       </w:tr>
       <w:tr>
+        <w:trPr>
+          <w:cantSplit/>
+        </w:trPr>
         <w:tc>
           <w:tcPr>
             <w:tcW w:type="dxa" w:w="3324"/>
@@ -22740,6 +23491,9 @@
         </w:tc>
       </w:tr>
       <w:tr>
+        <w:trPr>
+          <w:cantSplit/>
+        </w:trPr>
         <w:tc>
           <w:tcPr>
             <w:tcW w:type="dxa" w:w="3324"/>
@@ -22814,6 +23568,9 @@
         </w:tc>
       </w:tr>
       <w:tr>
+        <w:trPr>
+          <w:cantSplit/>
+        </w:trPr>
         <w:tc>
           <w:tcPr>
             <w:tcW w:type="dxa" w:w="3324"/>
@@ -22885,6 +23642,9 @@
         </w:tc>
       </w:tr>
       <w:tr>
+        <w:trPr>
+          <w:cantSplit/>
+        </w:trPr>
         <w:tc>
           <w:tcPr>
             <w:tcW w:type="dxa" w:w="3324"/>
@@ -22959,6 +23719,9 @@
         </w:tc>
       </w:tr>
       <w:tr>
+        <w:trPr>
+          <w:cantSplit/>
+        </w:trPr>
         <w:tc>
           <w:tcPr>
             <w:tcW w:type="dxa" w:w="3324"/>
@@ -23030,6 +23793,9 @@
         </w:tc>
       </w:tr>
       <w:tr>
+        <w:trPr>
+          <w:cantSplit/>
+        </w:trPr>
         <w:tc>
           <w:tcPr>
             <w:tcW w:type="dxa" w:w="3324"/>
@@ -23104,6 +23870,9 @@
         </w:tc>
       </w:tr>
       <w:tr>
+        <w:trPr>
+          <w:cantSplit/>
+        </w:trPr>
         <w:tc>
           <w:tcPr>
             <w:tcW w:type="dxa" w:w="3324"/>
@@ -23175,6 +23944,9 @@
         </w:tc>
       </w:tr>
       <w:tr>
+        <w:trPr>
+          <w:cantSplit/>
+        </w:trPr>
         <w:tc>
           <w:tcPr>
             <w:tcW w:type="dxa" w:w="3324"/>
@@ -23249,6 +24021,9 @@
         </w:tc>
       </w:tr>
       <w:tr>
+        <w:trPr>
+          <w:cantSplit/>
+        </w:trPr>
         <w:tc>
           <w:tcPr>
             <w:tcW w:type="dxa" w:w="3324"/>
@@ -23320,6 +24095,9 @@
         </w:tc>
       </w:tr>
       <w:tr>
+        <w:trPr>
+          <w:cantSplit/>
+        </w:trPr>
         <w:tc>
           <w:tcPr>
             <w:tcW w:type="dxa" w:w="3324"/>
@@ -23394,6 +24172,9 @@
         </w:tc>
       </w:tr>
       <w:tr>
+        <w:trPr>
+          <w:cantSplit/>
+        </w:trPr>
         <w:tc>
           <w:tcPr>
             <w:tcW w:type="dxa" w:w="3324"/>
@@ -23465,6 +24246,9 @@
         </w:tc>
       </w:tr>
       <w:tr>
+        <w:trPr>
+          <w:cantSplit/>
+        </w:trPr>
         <w:tc>
           <w:tcPr>
             <w:tcW w:type="dxa" w:w="3324"/>
@@ -23539,6 +24323,9 @@
         </w:tc>
       </w:tr>
       <w:tr>
+        <w:trPr>
+          <w:cantSplit/>
+        </w:trPr>
         <w:tc>
           <w:tcPr>
             <w:tcW w:type="dxa" w:w="3324"/>

</xml_diff>